<commit_message>
Ficha 4 alinhada à conta de padeiro do pitch: R$ 1.600 de custo, 67% de margem e meta de 7,5 horas por clínica
Co-Authored-By: Claude Opus 5.5 <noreply@anthropic.com>
Claude-Session: https://claude.ai/code/session_01PinPBG7GFUc6Efs6ijKbpo
</commit_message>
<xml_diff>
--- a/fichas/Ficha4_Grupo1_JalecON.docx
+++ b/fichas/Ficha4_Grupo1_JalecON.docx
@@ -514,7 +514,7 @@
                 <w:sz w:val="19"/>
                 <w:szCs w:val="19"/>
               </w:rPr>
-              <w:t xml:space="preserve"> Quer ouvir: "clínicas pagando o piloto e renovando, com custo de entrega dentro do teto e margem de 70%".</w:t>
+              <w:t xml:space="preserve"> Quer ouvir: "clínicas pagando o piloto e renovando, com o especialista em até 7,5 horas por clínica e margem de contribuição de 67%".</w:t>
             </w:r>
           </w:p>
         </w:tc>
@@ -819,7 +819,7 @@
                 <w:sz w:val="19"/>
                 <w:szCs w:val="19"/>
               </w:rPr>
-              <w:t xml:space="preserve"> 3 a 5 clínicas Pro (R$ 4.900 por mês) usando a plataforma com dados reais, nenhum cancelamento e custo de entrega abaixo do teto de R$ 1.470 por clínica, para manter 70% de margem.</w:t>
+              <w:t xml:space="preserve"> 3 a 5 clínicas Pro (R$ 4.900 por mês) usando a plataforma com dados reais, nenhum cancelamento e especialista em até 7,5 horas por clínica por mês, o que mantém o custo de entrega em R$ 1.600 e a margem de contribuição em 67%.</w:t>
             </w:r>
           </w:p>
           <w:p>
@@ -999,7 +999,7 @@
                 <w:sz w:val="19"/>
                 <w:szCs w:val="19"/>
               </w:rPr>
-              <w:t xml:space="preserve">– Custo de entrega por clínica, principalmente as horas de especialista (teto de R$ 1.470 por clínica Pro).</w:t>
+              <w:t xml:space="preserve">– Custo de entrega por clínica, principalmente as horas de especialista (meta: até 7,5 horas por clínica Pro, ou R$ 1.600 de custo total de entrega).</w:t>
             </w:r>
           </w:p>
           <w:p>
@@ -1109,7 +1109,7 @@
                 <w:sz w:val="19"/>
                 <w:szCs w:val="19"/>
               </w:rPr>
-              <w:t xml:space="preserve"> O custo dominante é a supervisão do especialista. Medimos as horas por clínica desde o piloto e só crescemos se o custo de entrega ficar abaixo de R$ 1.470 por clínica; acima disso, reduzimos o escopo ou o preço não se sustenta.</w:t>
+              <w:t xml:space="preserve"> O custo dominante é a supervisão do especialista. Medimos as horas por clínica desde o piloto e só crescemos se o especialista couber em até 7,5 horas por clínica (custo de entrega de R$ 1.600). Esse é o número que ainda é chute: com 10 horas, a margem cai para 62% e o equilíbrio passa de 10 para 11 clínicas; bem acima disso, reduzimos o escopo.</w:t>
             </w:r>
           </w:p>
         </w:tc>
@@ -1274,7 +1274,7 @@
                 <w:sz w:val="19"/>
                 <w:szCs w:val="19"/>
               </w:rPr>
-              <w:t xml:space="preserve"> cerca de R$ 250 mil de investimento anjo para 6 meses: completar as integrações de WhatsApp e agenda (R$ 90 mil), especialista em tempo integral (R$ 72 mil), conquista de clínicas (R$ 30 mil), validação jurídica das regras (R$ 15 mil), IA e ferramentas (R$ 12 mil) e reserva (R$ 31 mil). Objetivo: 10 clínicas pagantes com margem de 70%.</w:t>
+              <w:t xml:space="preserve"> cerca de R$ 250 mil de investimento anjo para 6 meses: completar as integrações de WhatsApp e agenda (R$ 90 mil), especialista em tempo integral (R$ 72 mil), conquista de clínicas (R$ 30 mil), validação jurídica das regras (R$ 15 mil), IA e ferramentas (R$ 12 mil) e reserva (R$ 31 mil). Objetivo: 10 clínicas pagantes, o ponto em que a margem de R$ 3.300 por clínica paga o custo fixo de R$ 32 mil por mês.</w:t>
             </w:r>
           </w:p>
         </w:tc>

</xml_diff>

<commit_message>
Ficha 4 e pitch coerentes com a Ficha 3: teto de R$ 1.470 por clínica (70% de margem), cortes de validação da Ficha 3 e o caminho desde as Fichas 1 e 2
Co-Authored-By: Claude Opus 5.5 <noreply@anthropic.com>
Claude-Session: https://claude.ai/code/session_01PinPBG7GFUc6Efs6ijKbpo
</commit_message>
<xml_diff>
--- a/fichas/Ficha4_Grupo1_JalecON.docx
+++ b/fichas/Ficha4_Grupo1_JalecON.docx
@@ -370,7 +370,7 @@
                 <w:sz w:val="19"/>
                 <w:szCs w:val="19"/>
               </w:rPr>
-              <w:t xml:space="preserve"> A JalecON atende muitas clínicas com a mesma plataforma, sem depender de uma empresa-mãe. O primeiro passo usa pouco capital: o protótipo funcional já existe e o piloto é pago pelas clínicas. Investimento externo só faz sentido depois que o piloto confirmar preço, custo de entrega e permanência das clínicas.</w:t>
+              <w:t xml:space="preserve"> A JalecON atende muitas clínicas com a mesma plataforma, sem depender de uma empresa-mãe. O primeiro passo usa pouco capital: o protótipo funcional já existe e o piloto é pago pelas clínicas. Investimento externo só faz sentido depois que o piloto confirmar preço, custo de entrega e permanência das clínicas. A rota segue o que aprendemos nas fichas: nas Fichas 1 e 2 o cliente era o médico de consultório; na Ficha 3 passamos para clínicas, que pagam pelo trabalho de vários médicos de uma vez e perdem pacientes no atendimento pelo WhatsApp.</w:t>
             </w:r>
           </w:p>
         </w:tc>
@@ -514,7 +514,7 @@
                 <w:sz w:val="19"/>
                 <w:szCs w:val="19"/>
               </w:rPr>
-              <w:t xml:space="preserve"> Quer ouvir: "clínicas pagando o piloto e renovando, com o especialista em até 7,5 horas por clínica e margem de contribuição de 67%".</w:t>
+              <w:t xml:space="preserve"> Quer ouvir: "clínicas pagando o piloto e renovando, com custo de entrega dentro do teto de R$ 1.470 por clínica e margem de 70%".</w:t>
             </w:r>
           </w:p>
         </w:tc>
@@ -798,7 +798,7 @@
                 <w:sz w:val="19"/>
                 <w:szCs w:val="19"/>
               </w:rPr>
-              <w:t xml:space="preserve"> a dor e o preço passam na pesquisa com gestores, pelos cortes fixados antes (insatisfação com o marketing atual e preço a partir de R$ 3.500).</w:t>
+              <w:t xml:space="preserve"> a dor e o preço passam na pesquisa com gestores, pelos cortes da Ficha 3: 3 de 5 insatisfeitos com o marketing atual, preço de R$ 3.500 aceito e pelo menos 2 aceitando o piloto pago.</w:t>
             </w:r>
           </w:p>
           <w:p>
@@ -819,7 +819,7 @@
                 <w:sz w:val="19"/>
                 <w:szCs w:val="19"/>
               </w:rPr>
-              <w:t xml:space="preserve"> 3 a 5 clínicas Pro (R$ 4.900 por mês) usando a plataforma com dados reais, nenhum cancelamento e especialista em até 7,5 horas por clínica por mês, o que mantém o custo de entrega em R$ 1.600 e a margem de contribuição em 67%.</w:t>
+              <w:t xml:space="preserve"> 3 a 5 clínicas Pro (R$ 4.900 por mês) usando a plataforma com dados reais, nenhum cancelamento e custo de entrega dentro do teto de R$ 1.470 por clínica, o que mantém 70% de margem (cada especialista atendendo cerca de 16 clínicas).</w:t>
             </w:r>
           </w:p>
           <w:p>
@@ -999,7 +999,7 @@
                 <w:sz w:val="19"/>
                 <w:szCs w:val="19"/>
               </w:rPr>
-              <w:t xml:space="preserve">– Custo de entrega por clínica, principalmente as horas de especialista (meta: até 7,5 horas por clínica Pro, ou R$ 1.600 de custo total de entrega).</w:t>
+              <w:t xml:space="preserve">– Custo de entrega por clínica, principalmente as horas de especialista (teto de R$ 1.470 por clínica Pro).</w:t>
             </w:r>
           </w:p>
           <w:p>
@@ -1109,7 +1109,7 @@
                 <w:sz w:val="19"/>
                 <w:szCs w:val="19"/>
               </w:rPr>
-              <w:t xml:space="preserve"> O custo dominante é a supervisão do especialista. Medimos as horas por clínica desde o piloto e só crescemos se o especialista couber em até 7,5 horas por clínica (custo de entrega de R$ 1.600). Esse é o número que ainda é chute: com 10 horas, a margem cai para 62% e o equilíbrio passa de 10 para 11 clínicas; bem acima disso, reduzimos o escopo.</w:t>
+              <w:t xml:space="preserve"> O custo dominante é a supervisão do especialista. Medimos as horas por clínica desde o piloto e só crescemos se o custo de entrega ficar dentro do teto de R$ 1.470 por clínica. O número que ainda é chute é quantas clínicas cada especialista atende: 16 no cenário base. Se forem 12, a margem cai para cerca de 65% e o equilíbrio passa de 10 para 11 clínicas; abaixo disso, reduzimos o escopo para marca, site e conteúdo, como prevê a Ficha 3.</w:t>
             </w:r>
           </w:p>
         </w:tc>
@@ -1274,7 +1274,7 @@
                 <w:sz w:val="19"/>
                 <w:szCs w:val="19"/>
               </w:rPr>
-              <w:t xml:space="preserve"> cerca de R$ 250 mil de investimento anjo para 6 meses: completar as integrações de WhatsApp e agenda (R$ 90 mil), especialista em tempo integral (R$ 72 mil), conquista de clínicas (R$ 30 mil), validação jurídica das regras (R$ 15 mil), IA e ferramentas (R$ 12 mil) e reserva (R$ 31 mil). Objetivo: 10 clínicas pagantes, o ponto em que a margem de R$ 3.300 por clínica paga o custo fixo de R$ 32 mil por mês.</w:t>
+              <w:t xml:space="preserve"> cerca de R$ 250 mil de investimento anjo para 6 meses: completar as integrações de WhatsApp e agenda (R$ 90 mil), especialista em tempo integral (R$ 72 mil), conquista de clínicas (R$ 30 mil), validação jurídica das regras (R$ 15 mil), IA e ferramentas (R$ 12 mil) e reserva (R$ 31 mil). Objetivo: 10 clínicas pagantes, o ponto em que a margem de R$ 3.430 por clínica paga o custo fixo de R$ 32 mil por mês.</w:t>
             </w:r>
           </w:p>
         </w:tc>

</xml_diff>

<commit_message>
Viabilidade pela lógica da disciplina: conta de padeiro com payback da clínica, LTV, CAC e recorrência; piloto pelo triângulo de ferro respondendo à suposição fatal (deck, Ficha 4 e roteiro)
Co-Authored-By: Claude Opus 5.5 <noreply@anthropic.com>
Claude-Session: https://claude.ai/code/session_01PinPBG7GFUc6Efs6ijKbpo
</commit_message>
<xml_diff>
--- a/fichas/Ficha4_Grupo1_JalecON.docx
+++ b/fichas/Ficha4_Grupo1_JalecON.docx
@@ -819,7 +819,7 @@
                 <w:sz w:val="19"/>
                 <w:szCs w:val="19"/>
               </w:rPr>
-              <w:t xml:space="preserve"> 3 a 5 clínicas Pro (R$ 4.900 por mês) usando a plataforma com dados reais, nenhum cancelamento e custo de entrega dentro do teto de R$ 1.470 por clínica, o que mantém 70% de margem (cada especialista atendendo cerca de 16 clínicas).</w:t>
+              <w:t xml:space="preserve"> 3 a 5 clínicas Pro (R$ 4.900 por mês) usando a plataforma com dados reais. O primeiro ciclo tem prazo e custo fixos: 3 meses, 3 clínicas e cerca de R$ 25 mil, pagos pelas mensalidades (R$ 44 mil); para caber, entram só WhatsApp, confirmação, conteúdo com o Guardião e painel. Passa se cada clínica ganhar pelo menos 11 consultas a mais por mês (o que paga a mensalidade), ninguém cancelar e o custo de entrega ficar dentro do teto de R$ 1.470 (70% de margem).</w:t>
             </w:r>
           </w:p>
           <w:p>
@@ -988,6 +988,18 @@
                 <w:szCs w:val="19"/>
               </w:rPr>
               <w:t xml:space="preserve">– Retenção: cancelamentos (meta do piloto: nenhum).</w:t>
+            </w:r>
+          </w:p>
+          <w:p>
+            <w:pPr>
+              <w:spacing w:before="20" w:after="40" w:line="264" w:lineRule="auto"/>
+            </w:pPr>
+            <w:r>
+              <w:rPr>
+                <w:sz w:val="19"/>
+                <w:szCs w:val="19"/>
+              </w:rPr>
+              <w:t xml:space="preserve">– Recorrência: LTV de cerca de R$ 82 mil por clínica (R$ 3.430 de margem por 24 meses), CAC de cerca de R$ 20 mil e payback em 6 meses. Contrato anual com desconto ajuda a manter as clínicas.</w:t>
             </w:r>
           </w:p>
           <w:p>

</xml_diff>